<commit_message>
Made changes Arun sir suggested
</commit_message>
<xml_diff>
--- a/public/GHM_Invoice.docx
+++ b/public/GHM_Invoice.docx
@@ -906,7 +906,35 @@
                 <w:b/>
                 <w:bCs/>
               </w:rPr>
-              <w:t>GST @ 18% on Subtotal (A):</w:t>
+              <w:t xml:space="preserve">GST @ 18% on </w:t>
+            </w:r>
+            <w:r>
+              <w:rPr>
+                <w:b/>
+                <w:bCs/>
+              </w:rPr>
+              <w:t xml:space="preserve">A </w:t>
+            </w:r>
+            <w:r>
+              <w:rPr>
+                <w:b/>
+                <w:bCs/>
+              </w:rPr>
+              <w:t>(</w:t>
+            </w:r>
+            <w:r>
+              <w:rPr>
+                <w:b/>
+                <w:bCs/>
+              </w:rPr>
+              <w:t>B</w:t>
+            </w:r>
+            <w:r>
+              <w:rPr>
+                <w:b/>
+                <w:bCs/>
+              </w:rPr>
+              <w:t>):</w:t>
             </w:r>
           </w:p>
         </w:tc>
@@ -1396,7 +1424,21 @@
                 <w:b/>
                 <w:bCs/>
               </w:rPr>
-              <w:t>Dining Charges Subtotal (B):</w:t>
+              <w:t>Dining Charges Subtotal (</w:t>
+            </w:r>
+            <w:r>
+              <w:rPr>
+                <w:b/>
+                <w:bCs/>
+              </w:rPr>
+              <w:t>C</w:t>
+            </w:r>
+            <w:r>
+              <w:rPr>
+                <w:b/>
+                <w:bCs/>
+              </w:rPr>
+              <w:t>):</w:t>
             </w:r>
           </w:p>
         </w:tc>
@@ -1463,7 +1505,35 @@
                 <w:b/>
                 <w:bCs/>
               </w:rPr>
-              <w:t>GST @ 5% on Subtotal (B):</w:t>
+              <w:t xml:space="preserve">GST @ 5% on </w:t>
+            </w:r>
+            <w:r>
+              <w:rPr>
+                <w:b/>
+                <w:bCs/>
+              </w:rPr>
+              <w:t>B</w:t>
+            </w:r>
+            <w:r>
+              <w:rPr>
+                <w:b/>
+                <w:bCs/>
+              </w:rPr>
+              <w:t xml:space="preserve"> (</w:t>
+            </w:r>
+            <w:r>
+              <w:rPr>
+                <w:b/>
+                <w:bCs/>
+              </w:rPr>
+              <w:t>D</w:t>
+            </w:r>
+            <w:r>
+              <w:rPr>
+                <w:b/>
+                <w:bCs/>
+              </w:rPr>
+              <w:t>):</w:t>
             </w:r>
           </w:p>
         </w:tc>
@@ -1530,7 +1600,21 @@
                 <w:b/>
                 <w:bCs/>
               </w:rPr>
-              <w:t>Grand Total (Including GST):</w:t>
+              <w:t>Grand Total (</w:t>
+            </w:r>
+            <w:r>
+              <w:rPr>
+                <w:b/>
+                <w:bCs/>
+              </w:rPr>
+              <w:t>A+B+C+D</w:t>
+            </w:r>
+            <w:r>
+              <w:rPr>
+                <w:b/>
+                <w:bCs/>
+              </w:rPr>
+              <w:t>):</w:t>
             </w:r>
           </w:p>
         </w:tc>

</xml_diff>